<commit_message>
Prepare KDP Kindle publishing artifacts
</commit_message>
<xml_diff>
--- a/dist/robo-trade-go-binance.docx
+++ b/dist/robo-trade-go-binance.docx
@@ -20,7 +20,7 @@
     </w:p>
     <w:p>
       <w:r>
-        <w:t>Autor: [Nome do Autor]</w:t>
+        <w:t>Autor: Addo Del Grossi</w:t>
       </w:r>
     </w:p>
     <w:p>
@@ -43,6 +43,39 @@
         <w:pStyle w:val="Heading2"/>
       </w:pPr>
       <w:r>
+        <w:t>Direitos autorais</w:t>
+      </w:r>
+    </w:p>
+    <w:p>
+      <w:r>
+        <w:t>Copyright © 2026 Addo Del Grossi. Todos os direitos reservados.</w:t>
+      </w:r>
+    </w:p>
+    <w:p>
+      <w:r>
+        <w:t>Este livro, sua capa e seus materiais editoriais não podem ser republicados, vendidos ou distribuídos como obra própria sem autorização do autor.</w:t>
+      </w:r>
+    </w:p>
+    <w:p>
+      <w:r>
+        <w:t>O código de exemplo que acompanha o livro, localizado na pasta codigo-robo-go-binance, é distribuído sob licença MIT para facilitar estudo, cópia e adaptação. A licença do código não altera os direitos autorais do texto do livro nem da capa.</w:t>
+      </w:r>
+    </w:p>
+    <w:p>
+      <w:r>
+        <w:t>Binance, Go, Kindle, Amazon e KDP são marcas de seus respectivos titulares. Este livro é independente e não é afiliado, patrocinado ou endossado por essas empresas ou projetos.</w:t>
+      </w:r>
+    </w:p>
+    <w:p>
+      <w:r>
+        <w:br/>
+      </w:r>
+    </w:p>
+    <w:p>
+      <w:pPr>
+        <w:pStyle w:val="Heading2"/>
+      </w:pPr>
+      <w:r>
         <w:t>Aviso importante</w:t>
       </w:r>
     </w:p>
@@ -289,6 +322,22 @@
       </w:pPr>
       <w:r>
         <w:t>Apêndice E: Referências</w:t>
+      </w:r>
+    </w:p>
+    <w:p>
+      <w:pPr>
+        <w:pStyle w:val="ListBullet"/>
+      </w:pPr>
+      <w:r>
+        <w:t>Sobre o autor</w:t>
+      </w:r>
+    </w:p>
+    <w:p>
+      <w:pPr>
+        <w:pStyle w:val="ListBullet"/>
+      </w:pPr>
+      <w:r>
+        <w:t>Encerramento</w:t>
       </w:r>
     </w:p>
     <w:p>
@@ -2165,13 +2214,17 @@
       <w:r>
         <w:t>type Decision struct {</w:t>
         <w:br/>
-        <w:t xml:space="preserve">    Signal    Signal</w:t>
+        <w:t xml:space="preserve">    Signal      Signal</w:t>
         <w:br/>
-        <w:t xml:space="preserve">    ShortSMA  float64</w:t>
+        <w:t xml:space="preserve">    ShortSMA    float64</w:t>
         <w:br/>
-        <w:t xml:space="preserve">    LongSMA   float64</w:t>
+        <w:t xml:space="preserve">    LongSMA     float64</w:t>
         <w:br/>
-        <w:t xml:space="preserve">    LastClose float64</w:t>
+        <w:t xml:space="preserve">    PrevShortMA float64</w:t>
+        <w:br/>
+        <w:t xml:space="preserve">    PrevLongMA  float64</w:t>
+        <w:br/>
+        <w:t xml:space="preserve">    LastClose   float64</w:t>
         <w:br/>
         <w:t>}</w:t>
       </w:r>
@@ -3605,6 +3658,11 @@
       </w:r>
     </w:p>
     <w:p>
+      <w:r>
+        <w:t>Para a primeira publicação deste projeto, a decisão editorial é: publicar como Kindle eBook, usar EPUB direto como manuscrito principal, escolher Amazon Brasil como marketplace primário e não entrar no KDP Select no lançamento.</w:t>
+      </w:r>
+    </w:p>
+    <w:p>
       <w:pPr>
         <w:pStyle w:val="Heading2"/>
       </w:pPr>
@@ -3824,6 +3882,30 @@
         <w:pStyle w:val="ListBullet"/>
       </w:pPr>
       <w:r>
+        <w:t>marketplace primário;</w:t>
+      </w:r>
+    </w:p>
+    <w:p>
+      <w:pPr>
+        <w:pStyle w:val="ListBullet"/>
+      </w:pPr>
+      <w:r>
+        <w:t>plano de royalty;</w:t>
+      </w:r>
+    </w:p>
+    <w:p>
+      <w:pPr>
+        <w:pStyle w:val="ListBullet"/>
+      </w:pPr>
+      <w:r>
+        <w:t>inscrição ou não no KDP Select;</w:t>
+      </w:r>
+    </w:p>
+    <w:p>
+      <w:pPr>
+        <w:pStyle w:val="ListBullet"/>
+      </w:pPr>
+      <w:r>
         <w:t>preço;</w:t>
       </w:r>
     </w:p>
@@ -3845,7 +3927,60 @@
     </w:p>
     <w:p>
       <w:r>
-        <w:t>Como este manuscrito foi produzido com ajuda de IA, o checklist recomenda marcar conteúdo AI-generated no KDP se você usar este texto ou capa como base final sem reescrita humana substancial.</w:t>
+        <w:t>Como este manuscrito e a capa foram produzidos com ajuda substancial de IA, a publicação deste pacote como está deve marcar disclosure de conteúdo AI-generated no KDP para texto e imagem de capa. Se você reescrever o texto e recriar a capa de forma substancial por conta própria, reavalie a política atual do KDP antes do upload.</w:t>
+      </w:r>
+    </w:p>
+    <w:p>
+      <w:r>
+        <w:t>Para este teste, use:</w:t>
+      </w:r>
+    </w:p>
+    <w:p>
+      <w:pPr>
+        <w:pStyle w:val="ListBullet"/>
+      </w:pPr>
+      <w:r>
+        <w:t>marketplace primário: Amazon Brasil;</w:t>
+      </w:r>
+    </w:p>
+    <w:p>
+      <w:pPr>
+        <w:pStyle w:val="ListBullet"/>
+      </w:pPr>
+      <w:r>
+        <w:t>direitos de publicação: obra própria, não domínio público;</w:t>
+      </w:r>
+    </w:p>
+    <w:p>
+      <w:pPr>
+        <w:pStyle w:val="ListBullet"/>
+      </w:pPr>
+      <w:r>
+        <w:t>territórios: todos os territórios, se você detém esses direitos;</w:t>
+      </w:r>
+    </w:p>
+    <w:p>
+      <w:pPr>
+        <w:pStyle w:val="ListBullet"/>
+      </w:pPr>
+      <w:r>
+        <w:t>KDP Select: não inscrito no lançamento;</w:t>
+      </w:r>
+    </w:p>
+    <w:p>
+      <w:pPr>
+        <w:pStyle w:val="ListBullet"/>
+      </w:pPr>
+      <w:r>
+        <w:t>preço inicial sugerido: R$ 9,90;</w:t>
+      </w:r>
+    </w:p>
+    <w:p>
+      <w:pPr>
+        <w:pStyle w:val="ListBullet"/>
+      </w:pPr>
+      <w:r>
+        <w:t>royalty esperado no Brasil sem KDP Select: 35%.</w:t>
       </w:r>
     </w:p>
     <w:p>
@@ -3932,7 +4067,7 @@
         <w:pStyle w:val="ListBullet"/>
       </w:pPr>
       <w:r>
-        <w:t>Marque disclosure de IA se aplicável.</w:t>
+        <w:t>Marque disclosure de IA para texto e capa se publicar esta versão como está.</w:t>
       </w:r>
     </w:p>
     <w:p>
@@ -3940,7 +4075,15 @@
         <w:pStyle w:val="ListBullet"/>
       </w:pPr>
       <w:r>
-        <w:t>Publique como teste com preço simples.</w:t>
+        <w:t>Não inscreva no KDP Select no primeiro lançamento.</w:t>
+      </w:r>
+    </w:p>
+    <w:p>
+      <w:pPr>
+        <w:pStyle w:val="ListBullet"/>
+      </w:pPr>
+      <w:r>
+        <w:t>Publique como teste com preço inicial sugerido de R$ 9,90.</w:t>
       </w:r>
     </w:p>
     <w:p>
@@ -5503,7 +5646,7 @@
     </w:p>
     <w:p>
       <w:r>
-        <w:t>Se texto, imagem ou tradução forem gerados por ferramenta de IA, o KDP exige disclosure de conteúdo gerado por IA. Se você apenas usou IA como assistência e revisou/criou substancialmente o conteúdo, a política diferencia AI-assisted de AI-generated. Na dúvida, seja transparente.</w:t>
+        <w:t>Se texto, imagem ou tradução forem gerados por ferramenta de IA, o KDP exige disclosure de conteúdo gerado por IA. Para publicar esta versão como está, marque texto e capa como conteúdo gerado por IA. Se você apenas usou IA como assistência e revisou/criou substancialmente o conteúdo, a política diferencia AI-assisted de AI-generated. Na dúvida, seja transparente.</w:t>
       </w:r>
     </w:p>
     <w:p>
@@ -5706,7 +5849,7 @@
         <w:pStyle w:val="ListBullet"/>
       </w:pPr>
       <w:r>
-        <w:t>Diretrizes de conteúdo KDP: https://kdp.amazon.com/self-publishing/help?topicId=A2AH1EAPH0YKI9</w:t>
+        <w:t>Diretrizes de conteúdo KDP: https://kdp.amazon.com/en_US/help/topic/G200672390</w:t>
       </w:r>
     </w:p>
     <w:p>
@@ -5715,8 +5858,36 @@
       </w:r>
     </w:p>
     <w:p>
-      <w:pPr>
-        <w:pStyle w:val="Heading2"/>
+      <w:r>
+        <w:br w:type="page"/>
+      </w:r>
+    </w:p>
+    <w:p>
+      <w:pPr>
+        <w:pStyle w:val="Heading1"/>
+      </w:pPr>
+      <w:r>
+        <w:t>Sobre o autor</w:t>
+      </w:r>
+    </w:p>
+    <w:p>
+      <w:r>
+        <w:t>Addo Del Grossi é o autor deste projeto educativo. Neste livro, ele organiza um experimento pequeno e prático para estudar Go, APIs, automação, segurança básica e publicação de um ebook técnico no KDP sem prometer resultado financeiro.</w:t>
+      </w:r>
+    </w:p>
+    <w:p>
+      <w:r>
+        <w:br/>
+      </w:r>
+    </w:p>
+    <w:p>
+      <w:r>
+        <w:br w:type="page"/>
+      </w:r>
+    </w:p>
+    <w:p>
+      <w:pPr>
+        <w:pStyle w:val="Heading1"/>
       </w:pPr>
       <w:r>
         <w:t>Encerramento</w:t>

</xml_diff>